<commit_message>
Publish atlas v0.3.0 safeguards and supplementary material v1.1.0
</commit_message>
<xml_diff>
--- a/research/supplementary/supplementary_material.docx
+++ b/research/supplementary/supplementary_material.docx
@@ -32,10 +32,31 @@
       <w:r>
         <w:t xml:space="preserve">Tables S1-S13 are supplied as CSV files in the accompanying archive. Tables S1, S2 and S10-S12 are also reproduced here. Figures S1-S6 are included below and as separate files. File names, units, scenario definitions and execution instructions are listed in README.md.</w:t>
       </w:r>
+      <w:r>
+        <w:t xml:space="preserve"> Reported values are rounded for readability. Error screens, percentage changes and assignments use unrounded values retained in the underlying data and code; displayed differences can therefore differ from differences calculated from rounded table entries. Numerical precision does not establish physical accuracy.</w:t>
+      </w:r>
     </w:p>
     <w:p>
       <w:r>
-        <w:t xml:space="preserve">Supplementary package version 1.0.0: https://github.com/alijahanirahaei/torino-urban-epw-atlas/releases/tag/supplement-v1.0.0</w:t>
+        <w:t xml:space="preserve">Supplementary</w:t>
+      </w:r>
+      <w:r>
+        <w:t xml:space="preserve"> package version 1.</w:t>
+      </w:r>
+      <w:r>
+        <w:t xml:space="preserve">1</w:t>
+      </w:r>
+      <w:r>
+        <w:t xml:space="preserve">.0</w:t>
+      </w:r>
+      <w:r>
+        <w:t xml:space="preserve">: https://github.com/alijahanirahaei/torino-urban-epw-atlas/releases/tag/supplement-v1.</w:t>
+      </w:r>
+      <w:r>
+        <w:t xml:space="preserve">1</w:t>
+      </w:r>
+      <w:r>
+        <w:t xml:space="preserve">.0</w:t>
       </w:r>
     </w:p>
     <w:p>
@@ -208,6 +229,97 @@
         </w:rPr>
         <w:t xml:space="preserve"> recalculates 250, 500 and 1000 m squares at 385 matched centres. The probability component contains 336 draws in 28 strata from the full-1000 m coverage frame; 304 pass the all-scale quality criteria. Its weighted variance analysis excludes 13 building-free and 19 inadequately height-covered 250 m supports. Targeted examples do not enter the probability estimator. These are different tests and neither measures a unique atmospheric footprint.</w:t>
       </w:r>
+      <w:r>
+        <w:rPr>
+          <w:b w:val="0"/>
+          <w:i w:val="0"/>
+        </w:rPr>
+        <w:t xml:space="preserve"> The 304-centre scale analysis applies the same design weights to total, within-class and between-class variances. Total height variance at 250/500/1000 m is 25.83/19.27/12.77 m²; its within-class component is 13.06/6.42/4.13 m². Total facade/site variance is 0.</w:t>
+      </w:r>
+      <w:r>
+        <w:rPr>
+          <w:b w:val="0"/>
+          <w:i w:val="0"/>
+        </w:rPr>
+        <w:t xml:space="preserve">125</w:t>
+      </w:r>
+      <w:r>
+        <w:rPr>
+          <w:b w:val="0"/>
+          <w:i w:val="0"/>
+        </w:rPr>
+        <w:t xml:space="preserve">/0.</w:t>
+      </w:r>
+      <w:r>
+        <w:rPr>
+          <w:b w:val="0"/>
+          <w:i w:val="0"/>
+        </w:rPr>
+        <w:t xml:space="preserve">103</w:t>
+      </w:r>
+      <w:r>
+        <w:rPr>
+          <w:b w:val="0"/>
+          <w:i w:val="0"/>
+        </w:rPr>
+        <w:t xml:space="preserve">/0.</w:t>
+      </w:r>
+      <w:r>
+        <w:rPr>
+          <w:b w:val="0"/>
+          <w:i w:val="0"/>
+        </w:rPr>
+        <w:t xml:space="preserve">075</w:t>
+      </w:r>
+      <w:r>
+        <w:rPr>
+          <w:b w:val="0"/>
+          <w:i w:val="0"/>
+        </w:rPr>
+        <w:t xml:space="preserve">, and its within-class component is 0.</w:t>
+      </w:r>
+      <w:r>
+        <w:rPr>
+          <w:b w:val="0"/>
+          <w:i w:val="0"/>
+        </w:rPr>
+        <w:t xml:space="preserve">042</w:t>
+      </w:r>
+      <w:r>
+        <w:rPr>
+          <w:b w:val="0"/>
+          <w:i w:val="0"/>
+        </w:rPr>
+        <w:t xml:space="preserve">/0.</w:t>
+      </w:r>
+      <w:r>
+        <w:rPr>
+          <w:b w:val="0"/>
+          <w:i w:val="0"/>
+        </w:rPr>
+        <w:t xml:space="preserve">024</w:t>
+      </w:r>
+      <w:r>
+        <w:rPr>
+          <w:b w:val="0"/>
+          <w:i w:val="0"/>
+        </w:rPr>
+        <w:t xml:space="preserve">/0.</w:t>
+      </w:r>
+      <w:r>
+        <w:rPr>
+          <w:b w:val="0"/>
+          <w:i w:val="0"/>
+        </w:rPr>
+        <w:t xml:space="preserve">020</w:t>
+      </w:r>
+      <w:r>
+        <w:rPr>
+          <w:b w:val="0"/>
+          <w:i w:val="0"/>
+        </w:rPr>
+        <w:t xml:space="preserve">. Thus the 250-to-500 m reductions are 25.4%/18.1% for total height/facade variance and 50.8%/43.3% within classes. Total equals within-class plus between-class variance; the distinction is not weighted versus unweighted analysis. The 500 m class labels remain fixed at every scale (Table S8).</w:t>
+      </w:r>
     </w:p>
     <w:p>
       <w:r>
@@ -254,7 +366,21 @@
           <w:b w:val="0"/>
           <w:i w:val="0"/>
         </w:rPr>
-        <w:t xml:space="preserve">The executed model is UWG 5.3.4 (Bueno et al., 2013, DOI 10.1080/19401493.2012.718797). The accompanying common-template JSON is an inherited scaffold containing 31-day and 1000 m placeholders; it is not the executed annual configuration. The four representative JSON files and the per-run heat-sensitivity JSONs record the actual annual support-specific inputs. Executed common assumptions include zone 4A, floor height 3.05 m, characteristic length 500 m, January 1 start, 365 days, a 300 s simulation step and 3600 s weather interval. Building stock is 40% large office and 60% midrise apartment, both post-1980 reference types. The sensible anthropogenic heat amplitude is 20 W m⁻² (10.014 W m⁻² annual scheduled mean), h_mix is 1, and day/night boundary-layer heights are 1000/80 m. These are shared controls, not district-specific surveyed or calibrated values. The UWG API spelling is </w:t>
+        <w:t xml:space="preserve">The executed model is UWG 5.3.4 (Bueno et al., 2013, DOI 10.1080/19401493.2012.718797). The accompanying common-template JSON is an inherited scaffold containing 31-day and 1000 m placeholders; it is not the executed annual configuration. The four representative JSON files and the per-run heat-sensitivity JSONs record the actual annual support-specific inputs. Executed common assumptions include zone 4A, floor height 3.05 m, characteristic length 500 m, January 1 start, 365 days, a 300 s simulation step and 3600 s weather interval. Building stock is 40% large office and 60% midrise apartment, both post-1980 reference types. The sensible anthropogenic heat amplitude is 20 W m⁻² (10.</w:t>
+      </w:r>
+      <w:r>
+        <w:rPr>
+          <w:b w:val="0"/>
+          <w:i w:val="0"/>
+        </w:rPr>
+        <w:t xml:space="preserve">01</w:t>
+      </w:r>
+      <w:r>
+        <w:rPr>
+          <w:b w:val="0"/>
+          <w:i w:val="0"/>
+        </w:rPr>
+        <w:t xml:space="preserve"> W m⁻² annual scheduled mean), h_mix is 1, and day/night boundary-layer heights are 1000/80 m. These are shared controls, not district-specific surveyed or calibrated values. The UWG API spelling is </w:t>
       </w:r>
       <w:r>
         <w:rPr>
@@ -417,7 +543,21 @@
           <w:b w:val="0"/>
           <w:i w:val="0"/>
         </w:rPr>
-        <w:t xml:space="preserve">All 105 stratified and 20 purposive cases succeed at 300 s. Grid 8230 fails at that timestep and remains excluded; a 180 s rerun is a separate diagnostic. The weighted P95 meets the 0.20 °C threshold, and the added P95 relative to seven medoids meets the 0.05 °C threshold. However, grid 1435 exceeds the 0.50 °C stress-test threshold, with an error of 1.331648 °C. The failure already occurs relative to the original C6 representative and is not generated by merging seven outputs. Only three of 13 tested boundary/cleanup switches improve annual fidelity.</w:t>
+        <w:t xml:space="preserve">All 105 stratified and 20 purposive cases succeed at 300 s. Grid 8230 fails at that timestep and remains excluded; a 180 s rerun is a separate diagnostic. The weighted P95 meets the 0.20 °C threshold, and the added P95 relative to seven medoids meets the 0.05 °C threshold. However, grid 1435 exceeds the 0.50 °C stress-test threshold, with an error of 1.</w:t>
+      </w:r>
+      <w:r>
+        <w:rPr>
+          <w:b w:val="0"/>
+          <w:i w:val="0"/>
+        </w:rPr>
+        <w:t xml:space="preserve">33</w:t>
+      </w:r>
+      <w:r>
+        <w:rPr>
+          <w:b w:val="0"/>
+          <w:i w:val="0"/>
+        </w:rPr>
+        <w:t xml:space="preserve"> °C. The failure already occurs relative to the original C6 representative and is not generated by merging seven outputs. Only three of 13 tested boundary/cleanup switches improve annual fidelity.</w:t>
       </w:r>
     </w:p>
     <w:p>
@@ -426,7 +566,138 @@
           <w:b w:val="0"/>
           <w:i w:val="0"/>
         </w:rPr>
-        <w:t xml:space="preserve">The high-density C6 analysis defines the tail by building fraction at or above 0.7951808541001185 (the class's 95th percentile) and identifies 20 overlapping strict-fit supports at two industrial sites. Official geometry/use checks and the maps below support physical interpretation. A geometry-selected alternative passes the two prospective holdouts at 0.479013 °C maximum, but the triggering support, grid 1435, remains at 0.559262 °C. Global replacement harms ordinary C6 cases. The warehouse comparison changes only the building type; it does not calibrate the model against a surveyed building-stock inventory. No fifth public EPW is adopted. The unqualified four-file recommendation excludes the flagged tail; this restriction does not resolve the original stress-test failure, and the stratified error distribution was not re-estimated after excluding the tail.</w:t>
+        <w:t xml:space="preserve">The high-density C6 analysis defines the tail by building fraction at or above </w:t>
+      </w:r>
+      <w:r>
+        <w:rPr>
+          <w:b w:val="0"/>
+          <w:i w:val="0"/>
+        </w:rPr>
+        <w:t xml:space="preserve">the</w:t>
+      </w:r>
+      <w:r>
+        <w:rPr>
+          <w:b w:val="0"/>
+          <w:i w:val="0"/>
+        </w:rPr>
+        <w:t xml:space="preserve"> 95th percentile</w:t>
+      </w:r>
+      <w:r>
+        <w:rPr>
+          <w:b w:val="0"/>
+          <w:i w:val="0"/>
+        </w:rPr>
+        <w:t xml:space="preserve"> of 390 strict-fitting C6 supports</w:t>
+      </w:r>
+      <w:r>
+        <w:rPr>
+          <w:b w:val="0"/>
+          <w:i w:val="0"/>
+        </w:rPr>
+        <w:t xml:space="preserve"> (approximately 0.795; the implementation uses the unrounded quantile</w:t>
+      </w:r>
+      <w:r>
+        <w:rPr>
+          <w:b w:val="0"/>
+          <w:i w:val="0"/>
+        </w:rPr>
+        <w:t xml:space="preserve">) and identifies 20 overlapping strict-fit supports at two industrial sites. Official geometry/use checks and the maps below support physical interpretation. A geometry-selected alternative passes the two prospective holdouts at 0.</w:t>
+      </w:r>
+      <w:r>
+        <w:rPr>
+          <w:b w:val="0"/>
+          <w:i w:val="0"/>
+        </w:rPr>
+        <w:t xml:space="preserve">48</w:t>
+      </w:r>
+      <w:r>
+        <w:rPr>
+          <w:b w:val="0"/>
+          <w:i w:val="0"/>
+        </w:rPr>
+        <w:t xml:space="preserve"> °C maximum, but the triggering support, grid 1435, remains at 0.</w:t>
+      </w:r>
+      <w:r>
+        <w:rPr>
+          <w:b w:val="0"/>
+          <w:i w:val="0"/>
+        </w:rPr>
+        <w:t xml:space="preserve">56</w:t>
+      </w:r>
+      <w:r>
+        <w:rPr>
+          <w:b w:val="0"/>
+          <w:i w:val="0"/>
+        </w:rPr>
+        <w:t xml:space="preserve"> °C. Global replacement harms ordinary C6 cases. The warehouse comparison changes only the building type; it does not calibrate the model against a surveyed building-stock inventory. No fifth public EPW is adopted. The unqualified four-file recommendation excludes the flagged tail; this </w:t>
+      </w:r>
+      <w:r>
+        <w:rPr>
+          <w:b w:val="0"/>
+          <w:i w:val="0"/>
+        </w:rPr>
+        <w:t xml:space="preserve">conservative post hoc guardrail is not a physically validated applicability boundary and</w:t>
+      </w:r>
+      <w:r>
+        <w:rPr>
+          <w:b w:val="0"/>
+          <w:i w:val="0"/>
+        </w:rPr>
+        <w:t xml:space="preserve"> does not resolve the original stress-test failure, and the stratified error distribution was not re-estimated after excluding the tail.</w:t>
+      </w:r>
+    </w:p>
+    <w:p>
+      <w:pPr>
+        <w:rPr/>
+      </w:pPr>
+      <w:r>
+        <w:rPr>
+          <w:b w:val="0"/>
+          <w:i w:val="0"/>
+        </w:rPr>
+        <w:t xml:space="preserve">The threshold is applied to all 413 assigned C6 locations among 12,862 assigned locations citywide. Rounding the cutoff to 0.795 changes none of the 20 restrictions; rounding to 0.80 would leave 19. Perturbing the exact cutoff by ±0.005 yields 19–22 restrictions, and ±0.010 yields 19–27. These are sensitivity checks, not confidence intervals. A further 19 C6 locations are caution-flagged between the strict-fitting 90th percentile (</w:t>
+      </w:r>
+      <w:r>
+        <w:rPr>
+          <w:b w:val="0"/>
+          <w:i w:val="0"/>
+        </w:rPr>
+        <w:t xml:space="preserve">approximately </w:t>
+      </w:r>
+      <w:r>
+        <w:rPr>
+          <w:b w:val="0"/>
+          <w:i w:val="0"/>
+        </w:rPr>
+        <w:t xml:space="preserve">0.</w:t>
+      </w:r>
+      <w:r>
+        <w:rPr>
+          <w:b w:val="0"/>
+          <w:i w:val="0"/>
+        </w:rPr>
+        <w:t xml:space="preserve">755</w:t>
+      </w:r>
+      <w:r>
+        <w:rPr>
+          <w:b w:val="0"/>
+          <w:i w:val="0"/>
+        </w:rPr>
+        <w:t xml:space="preserve">) and the restriction</w:t>
+      </w:r>
+      <w:r>
+        <w:rPr>
+          <w:b w:val="0"/>
+          <w:i w:val="0"/>
+        </w:rPr>
+        <w:t xml:space="preserve">. Both percentile thresholds are applied without rounding in the software</w:t>
+      </w:r>
+      <w:r>
+        <w:rPr>
+          <w:b w:val="0"/>
+          <w:i w:val="0"/>
+        </w:rPr>
+        <w:t xml:space="preserve">. The atlas exposes that flag in lookup warnings and spatial/tabular exports. Candidate downloads remain available in the caution band; neither that availability nor membership below the restriction establishes observational validity.</w:t>
       </w:r>
     </w:p>
     <w:p>
@@ -458,6 +729,13 @@
         </w:rPr>
         <w:t xml:space="preserve">The 2022 experiment uses processed, measurement-derived annual files aligned by nominal calendar and EPW hour in fixed UTC+1. There are 8,760 primary paired dry-bulb values per station. Uniform source flags do not recover which hours were measured or imputed. The comparison is therefore synchronized in time, but hourly measurement provenance cannot be resolved from the available processed files.</w:t>
       </w:r>
+      <w:r>
+        <w:rPr>
+          <w:b w:val="0"/>
+          <w:i w:val="0"/>
+        </w:rPr>
+        <w:t xml:space="preserve"> The selection statistic was the four-urban-station mean for 16 April–14 October: 2022 ranked first of ten years (2014–2023), with 22.44 °C versus the ten-year mean of 21.01 °C, an anomaly of +1.43 °C.</w:t>
+      </w:r>
     </w:p>
     <w:p>
       <w:r>
@@ -465,7 +743,21 @@
           <w:b w:val="0"/>
           <w:i w:val="0"/>
         </w:rPr>
-        <w:t xml:space="preserve">Bias is model minus urban observation; modelled UHI is model minus Caselle. RMSE improvement is Caselle-to-station RMSE minus model-to-station RMSE. Positive improvement indicates lower RMSE than the Caselle reference. The primary 95% temporal intervals use 5,000 paired seven-day circular moving-block replicates. One-, three- and fourteen-day blocks give the same annual improvement direction. A strict flatline sensitivity removes 62 Reiss Romoli hours and changes annual RMSE by at most 0.03021 °C. These intervals do not include all measurement or model uncertainty.</w:t>
+        <w:t xml:space="preserve">Bias is model minus urban observation; modelled UHI is model minus Caselle. RMSE improvement is Caselle-to-station RMSE minus model-to-station RMSE. Positive improvement indicates lower RMSE than the Caselle reference. The primary 95% temporal intervals use 5,000 paired seven-day circular moving-block replicates. One-, three- and fourteen-day blocks give the same annual improvement direction. A strict flatline sensitivity removes 62 Reiss Romoli hours and changes annual RMSE by at most 0.</w:t>
+      </w:r>
+      <w:r>
+        <w:rPr>
+          <w:b w:val="0"/>
+          <w:i w:val="0"/>
+        </w:rPr>
+        <w:t xml:space="preserve">03</w:t>
+      </w:r>
+      <w:r>
+        <w:rPr>
+          <w:b w:val="0"/>
+          <w:i w:val="0"/>
+        </w:rPr>
+        <w:t xml:space="preserve"> °C. These intervals do not include all measurement or model uncertainty.</w:t>
       </w:r>
     </w:p>
     <w:p>
@@ -544,7 +836,28 @@
           <w:b w:val="0"/>
           <w:i w:val="0"/>
         </w:rPr>
-        <w:t xml:space="preserve">release v0.2.0</w:t>
+        <w:t xml:space="preserve">atlas</w:t>
+      </w:r>
+      <w:r>
+        <w:rPr>
+          <w:b w:val="0"/>
+          <w:i w:val="0"/>
+        </w:rPr>
+        <w:t xml:space="preserve"> v0.</w:t>
+      </w:r>
+      <w:r>
+        <w:rPr>
+          <w:b w:val="0"/>
+          <w:i w:val="0"/>
+        </w:rPr>
+        <w:t xml:space="preserve">3</w:t>
+      </w:r>
+      <w:r>
+        <w:rPr>
+          <w:b w:val="0"/>
+          <w:i w:val="0"/>
+        </w:rPr>
+        <w:t xml:space="preserve">.0</w:t>
       </w:r>
       <w:r>
         <w:rPr>
@@ -751,6 +1064,13 @@
           <w:b w:val="0"/>
           <w:i w:val="0"/>
         </w:rPr>
+        <w:t xml:space="preserve"> v0.3.0</w:t>
+      </w:r>
+      <w:r>
+        <w:rPr>
+          <w:b w:val="0"/>
+          <w:i w:val="0"/>
+        </w:rPr>
         <w:t xml:space="preserve"> and </w:t>
       </w:r>
       <w:r>
@@ -786,7 +1106,56 @@
           <w:b w:val="0"/>
           <w:i w:val="0"/>
         </w:rPr>
-        <w:t xml:space="preserve">publicly available in GitHub release v0.2.0 at https://github.com/alijahanirahaei/torino-urban-epw-atlas/releases/tag/v0.2.0. The lookup enforces</w:t>
+        <w:t xml:space="preserve">distributed</w:t>
+      </w:r>
+      <w:r>
+        <w:rPr>
+          <w:b w:val="0"/>
+          <w:i w:val="0"/>
+        </w:rPr>
+        <w:t xml:space="preserve"> </w:t>
+      </w:r>
+      <w:r>
+        <w:rPr>
+          <w:b w:val="0"/>
+          <w:i w:val="0"/>
+        </w:rPr>
+        <w:t xml:space="preserve">through</w:t>
+      </w:r>
+      <w:r>
+        <w:rPr>
+          <w:b w:val="0"/>
+          <w:i w:val="0"/>
+        </w:rPr>
+        <w:t xml:space="preserve"> https://github.com/alijahanirahaei/torino-urban-epw-atlas/releases/tag/v0.</w:t>
+      </w:r>
+      <w:r>
+        <w:rPr>
+          <w:b w:val="0"/>
+          <w:i w:val="0"/>
+        </w:rPr>
+        <w:t xml:space="preserve">3.0. The four EPWs and exact UWG configurations retain their v0.</w:t>
+      </w:r>
+      <w:r>
+        <w:rPr>
+          <w:b w:val="0"/>
+          <w:i w:val="0"/>
+        </w:rPr>
+        <w:t xml:space="preserve">2.0</w:t>
+      </w:r>
+      <w:r>
+        <w:rPr>
+          <w:b w:val="0"/>
+          <w:i w:val="0"/>
+        </w:rPr>
+        <w:t xml:space="preserve"> identities and hashes</w:t>
+      </w:r>
+      <w:r>
+        <w:rPr>
+          <w:b w:val="0"/>
+          <w:i w:val="0"/>
+        </w:rPr>
+        <w:t xml:space="preserve">. The lookup enforces</w:t>
       </w:r>
       <w:r>
         <w:rPr>
@@ -1560,7 +1929,21 @@
           <w:b w:val="0"/>
           <w:i w:val="0"/>
         </w:rPr>
-        <w:t xml:space="preserve"> includes a diurnal profile. Its nominal 20 W/m2 amplitude produces annual prescribed mean heat of 10.01438356 W/m2; 10 and 40 W/m2 alternatives therefore halve and double that mean. The separate </w:t>
+        <w:t xml:space="preserve"> includes a diurnal profile. Its nominal 20 W/m2 amplitude produces annual prescribed mean heat of 10.</w:t>
+      </w:r>
+      <w:r>
+        <w:rPr>
+          <w:b w:val="0"/>
+          <w:i w:val="0"/>
+        </w:rPr>
+        <w:t xml:space="preserve">01</w:t>
+      </w:r>
+      <w:r>
+        <w:rPr>
+          <w:b w:val="0"/>
+          <w:i w:val="0"/>
+        </w:rPr>
+        <w:t xml:space="preserve"> W/m2; 10 and 40 W/m2 alternatives therefore halve and double that mean. The separate </w:t>
       </w:r>
       <w:r>
         <w:rPr>
@@ -1672,7 +2055,21 @@
           <w:b w:val="0"/>
           <w:i w:val="0"/>
         </w:rPr>
-        <w:t xml:space="preserve">For each state and writer precision, all 127 nonempty medoid subsets were evaluated. Selection minimises maximum annual hourly dry-bulb RMSE, followed by fitting-support-share-weighted mean RMSE and deterministic identifier ordering. The same criteria as in Section S4 were applied: best-four maximum no greater than 0.10 C; three-to-four improvement at least twice four-to-five improvement; and at most 0.05 C excess maximum error for the baseline representative identities simulated under each scenario. These are engineering diagnostics, not statistical confidence bounds or a global optimisation over the number of weather files.</w:t>
+        <w:t xml:space="preserve">For each state and writer precision, all 127 nonempty medoid subsets were evaluated. Selection minimises maximum annual hourly dry-bulb RMSE, followed by fitting-support-share-weighted mean RMSE and deterministic identifier ordering. The same criteria as in Section S4 were applied: best-four maximum no greater than 0.10 C; three-to-four improvement at least twice four-to-five improvement; and at most 0.05 C excess maximum error for the baseline representative identities simulated under each scenario. </w:t>
+      </w:r>
+      <w:r>
+        <w:rPr>
+          <w:b w:val="0"/>
+          <w:i w:val="0"/>
+        </w:rPr>
+        <w:t xml:space="preserve">The factor of two expresses an engineering diminishing-return requirement: the fifth-file gain should be no more than half the preceding gain. It is a heuristic applied to assess the curve-based working count, not a fitted physical constant. The fixed-set penalty compares the same scenario’s rerun baseline identities, with nearest assignments, against its optimal four-file subset. </w:t>
+      </w:r>
+      <w:r>
+        <w:rPr>
+          <w:b w:val="0"/>
+          <w:i w:val="0"/>
+        </w:rPr>
+        <w:t xml:space="preserve">These are engineering diagnostics, not statistical confidence bounds or a global optimisation over the number of weather files.</w:t>
       </w:r>
     </w:p>
     <w:p>
@@ -1711,7 +2108,49 @@
           <w:b w:val="0"/>
           <w:i w:val="0"/>
         </w:rPr>
-        <w:t xml:space="preserve">All nine primary states, including baseline, meet the three stated criteria; best-four maximum annual medoid RMSE is 0.035322-0.043476 C. The largest seasonal day/night error with the annual best-four mapping is 0.061794 C. The weighted secondary optimum changes to C1/C3/C5/C6 for zero HVAC canyon allocation, half allocation and road-up heat. The baseline identity set simulated under each scenario remains equivalent in the primary minimax objective in every state when nearest assignments may change. Hence a secondary-optimum change does not require replacing the representative identities to retain the minimax error, provided their files are rerun under the scenario.</w:t>
+        <w:t xml:space="preserve">All nine primary states, including baseline, meet the three stated criteria; best-four maximum annual medoid RMSE is 0.</w:t>
+      </w:r>
+      <w:r>
+        <w:rPr>
+          <w:b w:val="0"/>
+          <w:i w:val="0"/>
+        </w:rPr>
+        <w:t xml:space="preserve">035</w:t>
+      </w:r>
+      <w:r>
+        <w:rPr>
+          <w:b w:val="0"/>
+          <w:i w:val="0"/>
+        </w:rPr>
+        <w:t xml:space="preserve">-0.</w:t>
+      </w:r>
+      <w:r>
+        <w:rPr>
+          <w:b w:val="0"/>
+          <w:i w:val="0"/>
+        </w:rPr>
+        <w:t xml:space="preserve">043</w:t>
+      </w:r>
+      <w:r>
+        <w:rPr>
+          <w:b w:val="0"/>
+          <w:i w:val="0"/>
+        </w:rPr>
+        <w:t xml:space="preserve"> C. The largest seasonal day/night error with the annual best-four mapping is 0.</w:t>
+      </w:r>
+      <w:r>
+        <w:rPr>
+          <w:b w:val="0"/>
+          <w:i w:val="0"/>
+        </w:rPr>
+        <w:t xml:space="preserve">062</w:t>
+      </w:r>
+      <w:r>
+        <w:rPr>
+          <w:b w:val="0"/>
+          <w:i w:val="0"/>
+        </w:rPr>
+        <w:t xml:space="preserve"> C. The weighted secondary optimum changes to C1/C3/C5/C6 for zero HVAC canyon allocation, half allocation and road-up heat. The baseline identity set simulated under each scenario remains equivalent in the primary minimax objective in every state when nearest assignments may change. Hence a secondary-optimum change does not require replacing the representative identities to retain the minimax error, provided their files are rerun under the scenario.</w:t>
       </w:r>
     </w:p>
     <w:p>
@@ -1736,7 +2175,77 @@
           <w:b w:val="0"/>
           <w:i w:val="0"/>
         </w:rPr>
-        <w:t>, the unchanged baseline files and mapping reach maximum annual RMSE 0.119225 C and summer-night RMSE 0.260230 C, while scenario-specific best-four annual compression is 0.038197 C. C6's summer-night mean falls by 0.2377 C and its maximum hourly response is 1.114 C. These are model responses, not evidence of improved observed-station accuracy or a unique cause of nocturnal bias.</w:t>
+        <w:t xml:space="preserve">, the unchanged baseline files and mapping reach maximum annual RMSE 0.</w:t>
+      </w:r>
+      <w:r>
+        <w:rPr>
+          <w:b w:val="0"/>
+          <w:i w:val="0"/>
+        </w:rPr>
+        <w:t xml:space="preserve">119</w:t>
+      </w:r>
+      <w:r>
+        <w:rPr>
+          <w:b w:val="0"/>
+          <w:i w:val="0"/>
+        </w:rPr>
+        <w:t xml:space="preserve"> C and summer-night RMSE 0.</w:t>
+      </w:r>
+      <w:r>
+        <w:rPr>
+          <w:b w:val="0"/>
+          <w:i w:val="0"/>
+        </w:rPr>
+        <w:t xml:space="preserve">260</w:t>
+      </w:r>
+      <w:r>
+        <w:rPr>
+          <w:b w:val="0"/>
+          <w:i w:val="0"/>
+        </w:rPr>
+        <w:t xml:space="preserve"> C, while scenario-specific best-four annual compression is 0.</w:t>
+      </w:r>
+      <w:r>
+        <w:rPr>
+          <w:b w:val="0"/>
+          <w:i w:val="0"/>
+        </w:rPr>
+        <w:t xml:space="preserve">038</w:t>
+      </w:r>
+      <w:r>
+        <w:rPr>
+          <w:b w:val="0"/>
+          <w:i w:val="0"/>
+        </w:rPr>
+        <w:t xml:space="preserve"> C. C6's summer-night mean falls by 0.</w:t>
+      </w:r>
+      <w:r>
+        <w:rPr>
+          <w:b w:val="0"/>
+          <w:i w:val="0"/>
+        </w:rPr>
+        <w:t xml:space="preserve">24</w:t>
+      </w:r>
+      <w:r>
+        <w:rPr>
+          <w:b w:val="0"/>
+          <w:i w:val="0"/>
+        </w:rPr>
+        <w:t xml:space="preserve"> C and its maximum hourly response is 1.</w:t>
+      </w:r>
+      <w:r>
+        <w:rPr>
+          <w:b w:val="0"/>
+          <w:i w:val="0"/>
+        </w:rPr>
+        <w:t xml:space="preserve">11</w:t>
+      </w:r>
+      <w:r>
+        <w:rPr>
+          <w:b w:val="0"/>
+          <w:i w:val="0"/>
+        </w:rPr>
+        <w:t xml:space="preserve"> C. These are model responses, not evidence of improved observed-station accuracy or a unique cause of nocturnal bias.</w:t>
       </w:r>
     </w:p>
     <w:p>
@@ -1745,7 +2254,105 @@
           <w:b w:val="0"/>
           <w:i w:val="0"/>
         </w:rPr>
-        <w:t>The largest annual same-medoid response RMSE is 0.028060/0.047238 C for the half/double heat amplitudes, and 0.036734/0.038995 C for flat/delayed profiles. Spatial heat gives maxima near 0.025 C annually, although individual hourly differences reach approximately 0.42-0.50 C. The selected non-medoid maximum against its own class medoid is 0.348700 C at baseline and 0.347276/0.363368 C for road-up/road-down; grid 921 (C6) remains the maximum. Those sample maxima are not citywide percentiles or bounds for unsimulated supports.</w:t>
+        <w:t xml:space="preserve">The largest annual same-medoid response RMSE is 0.</w:t>
+      </w:r>
+      <w:r>
+        <w:rPr>
+          <w:b w:val="0"/>
+          <w:i w:val="0"/>
+        </w:rPr>
+        <w:t xml:space="preserve">028</w:t>
+      </w:r>
+      <w:r>
+        <w:rPr>
+          <w:b w:val="0"/>
+          <w:i w:val="0"/>
+        </w:rPr>
+        <w:t xml:space="preserve">/0.</w:t>
+      </w:r>
+      <w:r>
+        <w:rPr>
+          <w:b w:val="0"/>
+          <w:i w:val="0"/>
+        </w:rPr>
+        <w:t xml:space="preserve">047</w:t>
+      </w:r>
+      <w:r>
+        <w:rPr>
+          <w:b w:val="0"/>
+          <w:i w:val="0"/>
+        </w:rPr>
+        <w:t xml:space="preserve"> C for the half/double heat amplitudes, and 0.</w:t>
+      </w:r>
+      <w:r>
+        <w:rPr>
+          <w:b w:val="0"/>
+          <w:i w:val="0"/>
+        </w:rPr>
+        <w:t xml:space="preserve">037</w:t>
+      </w:r>
+      <w:r>
+        <w:rPr>
+          <w:b w:val="0"/>
+          <w:i w:val="0"/>
+        </w:rPr>
+        <w:t xml:space="preserve">/0.</w:t>
+      </w:r>
+      <w:r>
+        <w:rPr>
+          <w:b w:val="0"/>
+          <w:i w:val="0"/>
+        </w:rPr>
+        <w:t xml:space="preserve">039</w:t>
+      </w:r>
+      <w:r>
+        <w:rPr>
+          <w:b w:val="0"/>
+          <w:i w:val="0"/>
+        </w:rPr>
+        <w:t xml:space="preserve"> C for flat/delayed profiles. Spatial heat gives maxima near 0.025 C annually, although individual hourly differences reach approximately 0.42-0.50 C. The selected non-medoid maximum against its own class medoid is 0.</w:t>
+      </w:r>
+      <w:r>
+        <w:rPr>
+          <w:b w:val="0"/>
+          <w:i w:val="0"/>
+        </w:rPr>
+        <w:t xml:space="preserve">349</w:t>
+      </w:r>
+      <w:r>
+        <w:rPr>
+          <w:b w:val="0"/>
+          <w:i w:val="0"/>
+        </w:rPr>
+        <w:t xml:space="preserve"> C at baseline and 0.</w:t>
+      </w:r>
+      <w:r>
+        <w:rPr>
+          <w:b w:val="0"/>
+          <w:i w:val="0"/>
+        </w:rPr>
+        <w:t xml:space="preserve">347</w:t>
+      </w:r>
+      <w:r>
+        <w:rPr>
+          <w:b w:val="0"/>
+          <w:i w:val="0"/>
+        </w:rPr>
+        <w:t xml:space="preserve">/0.</w:t>
+      </w:r>
+      <w:r>
+        <w:rPr>
+          <w:b w:val="0"/>
+          <w:i w:val="0"/>
+        </w:rPr>
+        <w:t xml:space="preserve">363</w:t>
+      </w:r>
+      <w:r>
+        <w:rPr>
+          <w:b w:val="0"/>
+          <w:i w:val="0"/>
+        </w:rPr>
+        <w:t xml:space="preserve"> C for road-up/road-down; grid 921 (C6) remains the maximum. Those sample maxima are not citywide percentiles or bounds for unsimulated supports.</w:t>
       </w:r>
     </w:p>
     <w:p>
@@ -1754,7 +2361,35 @@
           <w:b w:val="0"/>
           <w:i w:val="0"/>
         </w:rPr>
-        <w:t xml:space="preserve">At three-decimal precision, three files meet the 0.10 C tolerance in seven states and two do in the two HVAC-allocation states. Four is therefore not the minimum count implied by this tolerance alone. At one decimal, road-down fails the improvement-ratio criterion (0.975955 rather than at least 2), despite acceptable four-file RMSE of 0.058637 C. Half-HVAC also changes preferred representatives between precisions. Thus the curve criterion is not fully serialization-invariant. Global sensitivity, parameter interactions, observed traffic and local stock or activity calibration remain outside the tested scope.</w:t>
+        <w:t xml:space="preserve">At three-decimal precision, three files meet the 0.10 C tolerance in seven states and two do in the two HVAC-allocation states. Four is therefore not the minimum count implied by this tolerance alone. At one decimal, road-down fails the improvement-ratio criterion (0.</w:t>
+      </w:r>
+      <w:r>
+        <w:rPr>
+          <w:b w:val="0"/>
+          <w:i w:val="0"/>
+        </w:rPr>
+        <w:t xml:space="preserve">98</w:t>
+      </w:r>
+      <w:r>
+        <w:rPr>
+          <w:b w:val="0"/>
+          <w:i w:val="0"/>
+        </w:rPr>
+        <w:t xml:space="preserve"> rather than at least 2), despite acceptable four-file RMSE of 0.</w:t>
+      </w:r>
+      <w:r>
+        <w:rPr>
+          <w:b w:val="0"/>
+          <w:i w:val="0"/>
+        </w:rPr>
+        <w:t xml:space="preserve">059</w:t>
+      </w:r>
+      <w:r>
+        <w:rPr>
+          <w:b w:val="0"/>
+          <w:i w:val="0"/>
+        </w:rPr>
+        <w:t xml:space="preserve"> C. Half-HVAC also changes preferred representatives between precisions. Thus the curve criterion is not fully serialization-invariant. Global sensitivity, parameter interactions, observed traffic and local stock or activity calibration remain outside the tested scope.</w:t>
       </w:r>
     </w:p>
     <w:p>
@@ -1775,7 +2410,21 @@
           <w:b w:val="0"/>
           <w:i w:val="0"/>
         </w:rPr>
-        <w:t xml:space="preserve">The 84 scenario integrations completed successfully in 960.4 seconds with four workers, with 3766.659 seconds summed worker time. Separate verification checked 210 EPW serializations (168 new and 42 reused), input hashes and intended changed keys, timestamp/schema identity, schedule integrals, subset optimisation and period metrics. The maximum curve discrepancy recalculated with a separate script was 2.78e-17 C. No tested output had relative humidity outside 0-100% or dew point above dry bulb. Verification was written within the same project, not performed by an external independent team; it does not establish physical realism.</w:t>
+        <w:t xml:space="preserve">The 84 scenario integrations completed successfully in 960.4 seconds with four workers, with 3766.</w:t>
+      </w:r>
+      <w:r>
+        <w:rPr>
+          <w:b w:val="0"/>
+          <w:i w:val="0"/>
+        </w:rPr>
+        <w:t xml:space="preserve">7</w:t>
+      </w:r>
+      <w:r>
+        <w:rPr>
+          <w:b w:val="0"/>
+          <w:i w:val="0"/>
+        </w:rPr>
+        <w:t xml:space="preserve"> seconds summed worker time. Separate verification checked 210 EPW serializations (168 new and 42 reused), input hashes and intended changed keys, timestamp/schema identity, schedule integrals, subset optimisation and period metrics. The maximum curve discrepancy recalculated with a separate script was 2.78e-17 C. No tested output had relative humidity outside 0-100% or dew point above dry bulb. Verification was written within the same project, not performed by an external independent team; it does not establish physical realism.</w:t>
       </w:r>
     </w:p>
     <w:p>
@@ -1836,7 +2485,70 @@
           <w:b w:val="0"/>
           <w:i w:val="0"/>
         </w:rPr>
-        <w:t xml:space="preserve">Complete minimax curve under the common UWG configuration. Extra digits distinguish numerical serialization effects; they do not indicate physical accuracy.</w:t>
+        <w:t xml:space="preserve">Complete minimax curve under the common UWG configuration. </w:t>
+      </w:r>
+      <w:r>
+        <w:rPr>
+          <w:b w:val="0"/>
+          <w:i w:val="0"/>
+        </w:rPr>
+        <w:t xml:space="preserve">RMSE</w:t>
+      </w:r>
+      <w:r>
+        <w:rPr>
+          <w:b w:val="0"/>
+          <w:i w:val="0"/>
+        </w:rPr>
+        <w:t xml:space="preserve"> </w:t>
+      </w:r>
+      <w:r>
+        <w:rPr>
+          <w:b w:val="0"/>
+          <w:i w:val="0"/>
+        </w:rPr>
+        <w:t xml:space="preserve">values</w:t>
+      </w:r>
+      <w:r>
+        <w:rPr>
+          <w:b w:val="0"/>
+          <w:i w:val="0"/>
+        </w:rPr>
+        <w:t xml:space="preserve"> </w:t>
+      </w:r>
+      <w:r>
+        <w:rPr>
+          <w:b w:val="0"/>
+          <w:i w:val="0"/>
+        </w:rPr>
+        <w:t xml:space="preserve">are displayed to three decimal places; unrounded values are retained in the companion CSV. The displayed precision describes</w:t>
+      </w:r>
+      <w:r>
+        <w:rPr>
+          <w:b w:val="0"/>
+          <w:i w:val="0"/>
+        </w:rPr>
+        <w:t xml:space="preserve"> numerical </w:t>
+      </w:r>
+      <w:r>
+        <w:rPr>
+          <w:b w:val="0"/>
+          <w:i w:val="0"/>
+        </w:rPr>
+        <w:t xml:space="preserve">diagnostics,</w:t>
+      </w:r>
+      <w:r>
+        <w:rPr>
+          <w:b w:val="0"/>
+          <w:i w:val="0"/>
+        </w:rPr>
+        <w:t xml:space="preserve"> not</w:t>
+      </w:r>
+      <w:r>
+        <w:rPr>
+          <w:b w:val="0"/>
+          <w:i w:val="0"/>
+        </w:rPr>
+        <w:t xml:space="preserve"> physical accuracy.</w:t>
       </w:r>
     </w:p>
     <w:tbl>
@@ -2026,7 +2738,15 @@
                 <w:i w:val="0"/>
                 <w:sz w:val="19"/>
               </w:rPr>
-              <w:t>0.16576927</w:t>
+              <w:t xml:space="preserve">0.</w:t>
+            </w:r>
+            <w:r>
+              <w:rPr>
+                <w:b w:val="0"/>
+                <w:i w:val="0"/>
+                <w:sz w:val="19"/>
+              </w:rPr>
+              <w:t xml:space="preserve">166</w:t>
             </w:r>
           </w:p>
         </w:tc>
@@ -2044,7 +2764,15 @@
                 <w:i w:val="0"/>
                 <w:sz w:val="19"/>
               </w:rPr>
-              <w:t>0.08615337</w:t>
+              <w:t xml:space="preserve">0.</w:t>
+            </w:r>
+            <w:r>
+              <w:rPr>
+                <w:b w:val="0"/>
+                <w:i w:val="0"/>
+                <w:sz w:val="19"/>
+              </w:rPr>
+              <w:t xml:space="preserve">086</w:t>
             </w:r>
           </w:p>
         </w:tc>
@@ -2121,7 +2849,15 @@
                 <w:i w:val="0"/>
                 <w:sz w:val="19"/>
               </w:rPr>
-              <w:t>0.11831677</w:t>
+              <w:t xml:space="preserve">0.</w:t>
+            </w:r>
+            <w:r>
+              <w:rPr>
+                <w:b w:val="0"/>
+                <w:i w:val="0"/>
+                <w:sz w:val="19"/>
+              </w:rPr>
+              <w:t xml:space="preserve">118</w:t>
             </w:r>
           </w:p>
         </w:tc>
@@ -2139,7 +2875,15 @@
                 <w:i w:val="0"/>
                 <w:sz w:val="19"/>
               </w:rPr>
-              <w:t>0.07817242</w:t>
+              <w:t xml:space="preserve">0.</w:t>
+            </w:r>
+            <w:r>
+              <w:rPr>
+                <w:b w:val="0"/>
+                <w:i w:val="0"/>
+                <w:sz w:val="19"/>
+              </w:rPr>
+              <w:t xml:space="preserve">078</w:t>
             </w:r>
           </w:p>
         </w:tc>
@@ -2216,7 +2960,15 @@
                 <w:i w:val="0"/>
                 <w:sz w:val="19"/>
               </w:rPr>
-              <w:t>0.07999715</w:t>
+              <w:t xml:space="preserve">0.</w:t>
+            </w:r>
+            <w:r>
+              <w:rPr>
+                <w:b w:val="0"/>
+                <w:i w:val="0"/>
+                <w:sz w:val="19"/>
+              </w:rPr>
+              <w:t xml:space="preserve">080</w:t>
             </w:r>
           </w:p>
         </w:tc>
@@ -2234,7 +2986,15 @@
                 <w:i w:val="0"/>
                 <w:sz w:val="19"/>
               </w:rPr>
-              <w:t>0.03765038</w:t>
+              <w:t xml:space="preserve">0.</w:t>
+            </w:r>
+            <w:r>
+              <w:rPr>
+                <w:b w:val="0"/>
+                <w:i w:val="0"/>
+                <w:sz w:val="19"/>
+              </w:rPr>
+              <w:t xml:space="preserve">038</w:t>
             </w:r>
           </w:p>
         </w:tc>
@@ -2311,7 +3071,15 @@
                 <w:i w:val="0"/>
                 <w:sz w:val="19"/>
               </w:rPr>
-              <w:t>0.05819782</w:t>
+              <w:t xml:space="preserve">0.</w:t>
+            </w:r>
+            <w:r>
+              <w:rPr>
+                <w:b w:val="0"/>
+                <w:i w:val="0"/>
+                <w:sz w:val="19"/>
+              </w:rPr>
+              <w:t xml:space="preserve">058</w:t>
             </w:r>
           </w:p>
         </w:tc>
@@ -2329,7 +3097,15 @@
                 <w:i w:val="0"/>
                 <w:sz w:val="19"/>
               </w:rPr>
-              <w:t>0.03027974</w:t>
+              <w:t xml:space="preserve">0.</w:t>
+            </w:r>
+            <w:r>
+              <w:rPr>
+                <w:b w:val="0"/>
+                <w:i w:val="0"/>
+                <w:sz w:val="19"/>
+              </w:rPr>
+              <w:t xml:space="preserve">030</w:t>
             </w:r>
           </w:p>
         </w:tc>
@@ -2406,7 +3182,15 @@
                 <w:i w:val="0"/>
                 <w:sz w:val="19"/>
               </w:rPr>
-              <w:t>0.05565098</w:t>
+              <w:t xml:space="preserve">0.</w:t>
+            </w:r>
+            <w:r>
+              <w:rPr>
+                <w:b w:val="0"/>
+                <w:i w:val="0"/>
+                <w:sz w:val="19"/>
+              </w:rPr>
+              <w:t xml:space="preserve">056</w:t>
             </w:r>
           </w:p>
         </w:tc>
@@ -2424,7 +3208,15 @@
                 <w:i w:val="0"/>
                 <w:sz w:val="19"/>
               </w:rPr>
-              <w:t>0.01391074</w:t>
+              <w:t xml:space="preserve">0.</w:t>
+            </w:r>
+            <w:r>
+              <w:rPr>
+                <w:b w:val="0"/>
+                <w:i w:val="0"/>
+                <w:sz w:val="19"/>
+              </w:rPr>
+              <w:t xml:space="preserve">014</w:t>
             </w:r>
           </w:p>
         </w:tc>
@@ -2501,7 +3293,15 @@
                 <w:i w:val="0"/>
                 <w:sz w:val="19"/>
               </w:rPr>
-              <w:t>0.04548069</w:t>
+              <w:t xml:space="preserve">0.</w:t>
+            </w:r>
+            <w:r>
+              <w:rPr>
+                <w:b w:val="0"/>
+                <w:i w:val="0"/>
+                <w:sz w:val="19"/>
+              </w:rPr>
+              <w:t xml:space="preserve">045</w:t>
             </w:r>
           </w:p>
         </w:tc>
@@ -2519,7 +3319,15 @@
                 <w:i w:val="0"/>
                 <w:sz w:val="19"/>
               </w:rPr>
-              <w:t>0.00604091</w:t>
+              <w:t xml:space="preserve">0.</w:t>
+            </w:r>
+            <w:r>
+              <w:rPr>
+                <w:b w:val="0"/>
+                <w:i w:val="0"/>
+                <w:sz w:val="19"/>
+              </w:rPr>
+              <w:t xml:space="preserve">006</w:t>
             </w:r>
           </w:p>
         </w:tc>
@@ -2596,7 +3404,15 @@
                 <w:i w:val="0"/>
                 <w:sz w:val="19"/>
               </w:rPr>
-              <w:t>0.00000000</w:t>
+              <w:t xml:space="preserve">0.</w:t>
+            </w:r>
+            <w:r>
+              <w:rPr>
+                <w:b w:val="0"/>
+                <w:i w:val="0"/>
+                <w:sz w:val="19"/>
+              </w:rPr>
+              <w:t xml:space="preserve">000</w:t>
             </w:r>
           </w:p>
         </w:tc>
@@ -2614,7 +3430,15 @@
                 <w:i w:val="0"/>
                 <w:sz w:val="19"/>
               </w:rPr>
-              <w:t>0.00000000</w:t>
+              <w:t xml:space="preserve">0.</w:t>
+            </w:r>
+            <w:r>
+              <w:rPr>
+                <w:b w:val="0"/>
+                <w:i w:val="0"/>
+                <w:sz w:val="19"/>
+              </w:rPr>
+              <w:t xml:space="preserve">000</w:t>
             </w:r>
           </w:p>
         </w:tc>
@@ -2691,7 +3515,15 @@
                 <w:i w:val="0"/>
                 <w:sz w:val="19"/>
               </w:rPr>
-              <w:t>0.16079733</w:t>
+              <w:t xml:space="preserve">0.</w:t>
+            </w:r>
+            <w:r>
+              <w:rPr>
+                <w:b w:val="0"/>
+                <w:i w:val="0"/>
+                <w:sz w:val="19"/>
+              </w:rPr>
+              <w:t xml:space="preserve">161</w:t>
             </w:r>
           </w:p>
         </w:tc>
@@ -2709,7 +3541,15 @@
                 <w:i w:val="0"/>
                 <w:sz w:val="19"/>
               </w:rPr>
-              <w:t>0.07432242</w:t>
+              <w:t xml:space="preserve">0.</w:t>
+            </w:r>
+            <w:r>
+              <w:rPr>
+                <w:b w:val="0"/>
+                <w:i w:val="0"/>
+                <w:sz w:val="19"/>
+              </w:rPr>
+              <w:t xml:space="preserve">074</w:t>
             </w:r>
           </w:p>
         </w:tc>
@@ -2786,7 +3626,15 @@
                 <w:i w:val="0"/>
                 <w:sz w:val="19"/>
               </w:rPr>
-              <w:t>0.10929367</w:t>
+              <w:t xml:space="preserve">0.</w:t>
+            </w:r>
+            <w:r>
+              <w:rPr>
+                <w:b w:val="0"/>
+                <w:i w:val="0"/>
+                <w:sz w:val="19"/>
+              </w:rPr>
+              <w:t xml:space="preserve">109</w:t>
             </w:r>
           </w:p>
         </w:tc>
@@ -2804,7 +3652,15 @@
                 <w:i w:val="0"/>
                 <w:sz w:val="19"/>
               </w:rPr>
-              <w:t>0.06862290</w:t>
+              <w:t xml:space="preserve">0.</w:t>
+            </w:r>
+            <w:r>
+              <w:rPr>
+                <w:b w:val="0"/>
+                <w:i w:val="0"/>
+                <w:sz w:val="19"/>
+              </w:rPr>
+              <w:t xml:space="preserve">069</w:t>
             </w:r>
           </w:p>
         </w:tc>
@@ -2881,7 +3737,15 @@
                 <w:i w:val="0"/>
                 <w:sz w:val="19"/>
               </w:rPr>
-              <w:t>0.06999050</w:t>
+              <w:t xml:space="preserve">0.</w:t>
+            </w:r>
+            <w:r>
+              <w:rPr>
+                <w:b w:val="0"/>
+                <w:i w:val="0"/>
+                <w:sz w:val="19"/>
+              </w:rPr>
+              <w:t xml:space="preserve">070</w:t>
             </w:r>
           </w:p>
         </w:tc>
@@ -2899,7 +3763,15 @@
                 <w:i w:val="0"/>
                 <w:sz w:val="19"/>
               </w:rPr>
-              <w:t>0.02955985</w:t>
+              <w:t xml:space="preserve">0.</w:t>
+            </w:r>
+            <w:r>
+              <w:rPr>
+                <w:b w:val="0"/>
+                <w:i w:val="0"/>
+                <w:sz w:val="19"/>
+              </w:rPr>
+              <w:t xml:space="preserve">030</w:t>
             </w:r>
           </w:p>
         </w:tc>
@@ -2976,7 +3848,15 @@
                 <w:i w:val="0"/>
                 <w:sz w:val="19"/>
               </w:rPr>
-              <w:t>0.04018696</w:t>
+              <w:t xml:space="preserve">0.</w:t>
+            </w:r>
+            <w:r>
+              <w:rPr>
+                <w:b w:val="0"/>
+                <w:i w:val="0"/>
+                <w:sz w:val="19"/>
+              </w:rPr>
+              <w:t xml:space="preserve">040</w:t>
             </w:r>
           </w:p>
         </w:tc>
@@ -2994,7 +3874,15 @@
                 <w:i w:val="0"/>
                 <w:sz w:val="19"/>
               </w:rPr>
-              <w:t>0.01824417</w:t>
+              <w:t xml:space="preserve">0.</w:t>
+            </w:r>
+            <w:r>
+              <w:rPr>
+                <w:b w:val="0"/>
+                <w:i w:val="0"/>
+                <w:sz w:val="19"/>
+              </w:rPr>
+              <w:t xml:space="preserve">018</w:t>
             </w:r>
           </w:p>
         </w:tc>
@@ -3071,7 +3959,15 @@
                 <w:i w:val="0"/>
                 <w:sz w:val="19"/>
               </w:rPr>
-              <w:t>0.03165222</w:t>
+              <w:t xml:space="preserve">0.</w:t>
+            </w:r>
+            <w:r>
+              <w:rPr>
+                <w:b w:val="0"/>
+                <w:i w:val="0"/>
+                <w:sz w:val="19"/>
+              </w:rPr>
+              <w:t xml:space="preserve">032</w:t>
             </w:r>
           </w:p>
         </w:tc>
@@ -3089,7 +3985,15 @@
                 <w:i w:val="0"/>
                 <w:sz w:val="19"/>
               </w:rPr>
-              <w:t>0.00762161</w:t>
+              <w:t xml:space="preserve">0.</w:t>
+            </w:r>
+            <w:r>
+              <w:rPr>
+                <w:b w:val="0"/>
+                <w:i w:val="0"/>
+                <w:sz w:val="19"/>
+              </w:rPr>
+              <w:t xml:space="preserve">008</w:t>
             </w:r>
           </w:p>
         </w:tc>
@@ -3166,7 +4070,15 @@
                 <w:i w:val="0"/>
                 <w:sz w:val="19"/>
               </w:rPr>
-              <w:t>0.02368211</w:t>
+              <w:t xml:space="preserve">0.</w:t>
+            </w:r>
+            <w:r>
+              <w:rPr>
+                <w:b w:val="0"/>
+                <w:i w:val="0"/>
+                <w:sz w:val="19"/>
+              </w:rPr>
+              <w:t xml:space="preserve">024</w:t>
             </w:r>
           </w:p>
         </w:tc>
@@ -3184,7 +4096,15 @@
                 <w:i w:val="0"/>
                 <w:sz w:val="19"/>
               </w:rPr>
-              <w:t>0.00314554</w:t>
+              <w:t xml:space="preserve">0.</w:t>
+            </w:r>
+            <w:r>
+              <w:rPr>
+                <w:b w:val="0"/>
+                <w:i w:val="0"/>
+                <w:sz w:val="19"/>
+              </w:rPr>
+              <w:t xml:space="preserve">003</w:t>
             </w:r>
           </w:p>
         </w:tc>
@@ -3261,7 +4181,15 @@
                 <w:i w:val="0"/>
                 <w:sz w:val="19"/>
               </w:rPr>
-              <w:t>0.00000000</w:t>
+              <w:t xml:space="preserve">0.</w:t>
+            </w:r>
+            <w:r>
+              <w:rPr>
+                <w:b w:val="0"/>
+                <w:i w:val="0"/>
+                <w:sz w:val="19"/>
+              </w:rPr>
+              <w:t xml:space="preserve">000</w:t>
             </w:r>
           </w:p>
         </w:tc>
@@ -3279,7 +4207,15 @@
                 <w:i w:val="0"/>
                 <w:sz w:val="19"/>
               </w:rPr>
-              <w:t>0.00000000</w:t>
+              <w:t xml:space="preserve">0.</w:t>
+            </w:r>
+            <w:r>
+              <w:rPr>
+                <w:b w:val="0"/>
+                <w:i w:val="0"/>
+                <w:sz w:val="19"/>
+              </w:rPr>
+              <w:t xml:space="preserve">000</w:t>
             </w:r>
           </w:p>
         </w:tc>
@@ -3312,6 +4248,13 @@
           <w:i w:val="0"/>
         </w:rPr>
         <w:t>WGS84 centres of the 100 m assignment cells identifying the four 500 m square representative supports. These are not station coordinates.</w:t>
+      </w:r>
+      <w:r>
+        <w:rPr>
+          <w:b w:val="0"/>
+          <w:i w:val="0"/>
+        </w:rPr>
+        <w:t xml:space="preserve"> Coordinates are displayed to five decimal places; the companion CSV retains full precision.</w:t>
       </w:r>
     </w:p>
     <w:tbl>
@@ -3510,7 +4453,15 @@
                 <w:i w:val="0"/>
                 <w:sz w:val="19"/>
               </w:rPr>
-              <w:t>7.72025043</w:t>
+              <w:t xml:space="preserve">7.</w:t>
+            </w:r>
+            <w:r>
+              <w:rPr>
+                <w:b w:val="0"/>
+                <w:i w:val="0"/>
+                <w:sz w:val="19"/>
+              </w:rPr>
+              <w:t xml:space="preserve">72025</w:t>
             </w:r>
           </w:p>
         </w:tc>
@@ -3529,7 +4480,15 @@
                 <w:i w:val="0"/>
                 <w:sz w:val="19"/>
               </w:rPr>
-              <w:t>45.05026090</w:t>
+              <w:t xml:space="preserve">45.</w:t>
+            </w:r>
+            <w:r>
+              <w:rPr>
+                <w:b w:val="0"/>
+                <w:i w:val="0"/>
+                <w:sz w:val="19"/>
+              </w:rPr>
+              <w:t xml:space="preserve">05026</w:t>
             </w:r>
           </w:p>
         </w:tc>
@@ -3610,7 +4569,15 @@
                 <w:i w:val="0"/>
                 <w:sz w:val="19"/>
               </w:rPr>
-              <w:t>7.63526221</w:t>
+              <w:t xml:space="preserve">7.</w:t>
+            </w:r>
+            <w:r>
+              <w:rPr>
+                <w:b w:val="0"/>
+                <w:i w:val="0"/>
+                <w:sz w:val="19"/>
+              </w:rPr>
+              <w:t xml:space="preserve">63526</w:t>
             </w:r>
           </w:p>
         </w:tc>
@@ -3629,7 +4596,15 @@
                 <w:i w:val="0"/>
                 <w:sz w:val="19"/>
               </w:rPr>
-              <w:t>45.09968571</w:t>
+              <w:t xml:space="preserve">45.</w:t>
+            </w:r>
+            <w:r>
+              <w:rPr>
+                <w:b w:val="0"/>
+                <w:i w:val="0"/>
+                <w:sz w:val="19"/>
+              </w:rPr>
+              <w:t xml:space="preserve">09969</w:t>
             </w:r>
           </w:p>
         </w:tc>
@@ -3710,7 +4685,15 @@
                 <w:i w:val="0"/>
                 <w:sz w:val="19"/>
               </w:rPr>
-              <w:t>7.65393902</w:t>
+              <w:t xml:space="preserve">7.</w:t>
+            </w:r>
+            <w:r>
+              <w:rPr>
+                <w:b w:val="0"/>
+                <w:i w:val="0"/>
+                <w:sz w:val="19"/>
+              </w:rPr>
+              <w:t xml:space="preserve">65394</w:t>
             </w:r>
           </w:p>
         </w:tc>
@@ -3729,7 +4712,15 @@
                 <w:i w:val="0"/>
                 <w:sz w:val="19"/>
               </w:rPr>
-              <w:t>45.06210060</w:t>
+              <w:t xml:space="preserve">45.</w:t>
+            </w:r>
+            <w:r>
+              <w:rPr>
+                <w:b w:val="0"/>
+                <w:i w:val="0"/>
+                <w:sz w:val="19"/>
+              </w:rPr>
+              <w:t xml:space="preserve">06210</w:t>
             </w:r>
           </w:p>
         </w:tc>
@@ -3806,7 +4797,15 @@
                 <w:i w:val="0"/>
                 <w:sz w:val="19"/>
               </w:rPr>
-              <w:t>7.62421993</w:t>
+              <w:t xml:space="preserve">7.</w:t>
+            </w:r>
+            <w:r>
+              <w:rPr>
+                <w:b w:val="0"/>
+                <w:i w:val="0"/>
+                <w:sz w:val="19"/>
+              </w:rPr>
+              <w:t xml:space="preserve">62422</w:t>
             </w:r>
           </w:p>
         </w:tc>
@@ -3824,7 +4823,15 @@
                 <w:i w:val="0"/>
                 <w:sz w:val="19"/>
               </w:rPr>
-              <w:t>45.03024041</w:t>
+              <w:t xml:space="preserve">45.</w:t>
+            </w:r>
+            <w:r>
+              <w:rPr>
+                <w:b w:val="0"/>
+                <w:i w:val="0"/>
+                <w:sz w:val="19"/>
+              </w:rPr>
+              <w:t xml:space="preserve">03024</w:t>
             </w:r>
           </w:p>
         </w:tc>
@@ -4824,7 +5831,15 @@
                 <w:i w:val="0"/>
                 <w:sz w:val="19"/>
               </w:rPr>
-              <w:t>0.040187</w:t>
+              <w:t xml:space="preserve">0.</w:t>
+            </w:r>
+            <w:r>
+              <w:rPr>
+                <w:b w:val="0"/>
+                <w:i w:val="0"/>
+                <w:sz w:val="19"/>
+              </w:rPr>
+              <w:t xml:space="preserve">040</w:t>
             </w:r>
           </w:p>
         </w:tc>
@@ -4842,7 +5857,15 @@
                 <w:i w:val="0"/>
                 <w:sz w:val="19"/>
               </w:rPr>
-              <w:t>0.040187</w:t>
+              <w:t xml:space="preserve">0.</w:t>
+            </w:r>
+            <w:r>
+              <w:rPr>
+                <w:b w:val="0"/>
+                <w:i w:val="0"/>
+                <w:sz w:val="19"/>
+              </w:rPr>
+              <w:t xml:space="preserve">040</w:t>
             </w:r>
           </w:p>
         </w:tc>
@@ -4901,7 +5924,15 @@
                 <w:i w:val="0"/>
                 <w:sz w:val="19"/>
               </w:rPr>
-              <w:t>0.043476</w:t>
+              <w:t xml:space="preserve">0.</w:t>
+            </w:r>
+            <w:r>
+              <w:rPr>
+                <w:b w:val="0"/>
+                <w:i w:val="0"/>
+                <w:sz w:val="19"/>
+              </w:rPr>
+              <w:t xml:space="preserve">043</w:t>
             </w:r>
           </w:p>
         </w:tc>
@@ -4919,7 +5950,15 @@
                 <w:i w:val="0"/>
                 <w:sz w:val="19"/>
               </w:rPr>
-              <w:t>0.051526</w:t>
+              <w:t xml:space="preserve">0.</w:t>
+            </w:r>
+            <w:r>
+              <w:rPr>
+                <w:b w:val="0"/>
+                <w:i w:val="0"/>
+                <w:sz w:val="19"/>
+              </w:rPr>
+              <w:t xml:space="preserve">052</w:t>
             </w:r>
           </w:p>
         </w:tc>
@@ -4978,7 +6017,15 @@
                 <w:i w:val="0"/>
                 <w:sz w:val="19"/>
               </w:rPr>
-              <w:t>0.035801</w:t>
+              <w:t xml:space="preserve">0.</w:t>
+            </w:r>
+            <w:r>
+              <w:rPr>
+                <w:b w:val="0"/>
+                <w:i w:val="0"/>
+                <w:sz w:val="19"/>
+              </w:rPr>
+              <w:t xml:space="preserve">036</w:t>
             </w:r>
           </w:p>
         </w:tc>
@@ -4996,7 +6043,15 @@
                 <w:i w:val="0"/>
                 <w:sz w:val="19"/>
               </w:rPr>
-              <w:t>0.048878</w:t>
+              <w:t xml:space="preserve">0.</w:t>
+            </w:r>
+            <w:r>
+              <w:rPr>
+                <w:b w:val="0"/>
+                <w:i w:val="0"/>
+                <w:sz w:val="19"/>
+              </w:rPr>
+              <w:t xml:space="preserve">049</w:t>
             </w:r>
           </w:p>
         </w:tc>
@@ -5055,7 +6110,15 @@
                 <w:i w:val="0"/>
                 <w:sz w:val="19"/>
               </w:rPr>
-              <w:t>0.036013</w:t>
+              <w:t xml:space="preserve">0.</w:t>
+            </w:r>
+            <w:r>
+              <w:rPr>
+                <w:b w:val="0"/>
+                <w:i w:val="0"/>
+                <w:sz w:val="19"/>
+              </w:rPr>
+              <w:t xml:space="preserve">036</w:t>
             </w:r>
           </w:p>
         </w:tc>
@@ -5073,7 +6136,15 @@
                 <w:i w:val="0"/>
                 <w:sz w:val="19"/>
               </w:rPr>
-              <w:t>0.036734</w:t>
+              <w:t xml:space="preserve">0.</w:t>
+            </w:r>
+            <w:r>
+              <w:rPr>
+                <w:b w:val="0"/>
+                <w:i w:val="0"/>
+                <w:sz w:val="19"/>
+              </w:rPr>
+              <w:t xml:space="preserve">037</w:t>
             </w:r>
           </w:p>
         </w:tc>
@@ -5132,7 +6203,15 @@
                 <w:i w:val="0"/>
                 <w:sz w:val="19"/>
               </w:rPr>
-              <w:t>0.038713</w:t>
+              <w:t xml:space="preserve">0.</w:t>
+            </w:r>
+            <w:r>
+              <w:rPr>
+                <w:b w:val="0"/>
+                <w:i w:val="0"/>
+                <w:sz w:val="19"/>
+              </w:rPr>
+              <w:t xml:space="preserve">039</w:t>
             </w:r>
           </w:p>
         </w:tc>
@@ -5150,7 +6229,15 @@
                 <w:i w:val="0"/>
                 <w:sz w:val="19"/>
               </w:rPr>
-              <w:t>0.044770</w:t>
+              <w:t xml:space="preserve">0.</w:t>
+            </w:r>
+            <w:r>
+              <w:rPr>
+                <w:b w:val="0"/>
+                <w:i w:val="0"/>
+                <w:sz w:val="19"/>
+              </w:rPr>
+              <w:t xml:space="preserve">045</w:t>
             </w:r>
           </w:p>
         </w:tc>
@@ -5209,7 +6296,15 @@
                 <w:i w:val="0"/>
                 <w:sz w:val="19"/>
               </w:rPr>
-              <w:t>0.038197</w:t>
+              <w:t xml:space="preserve">0.</w:t>
+            </w:r>
+            <w:r>
+              <w:rPr>
+                <w:b w:val="0"/>
+                <w:i w:val="0"/>
+                <w:sz w:val="19"/>
+              </w:rPr>
+              <w:t xml:space="preserve">038</w:t>
             </w:r>
           </w:p>
         </w:tc>
@@ -5227,7 +6322,15 @@
                 <w:i w:val="0"/>
                 <w:sz w:val="19"/>
               </w:rPr>
-              <w:t>0.119225</w:t>
+              <w:t xml:space="preserve">0.</w:t>
+            </w:r>
+            <w:r>
+              <w:rPr>
+                <w:b w:val="0"/>
+                <w:i w:val="0"/>
+                <w:sz w:val="19"/>
+              </w:rPr>
+              <w:t xml:space="preserve">119</w:t>
             </w:r>
           </w:p>
         </w:tc>
@@ -5286,7 +6389,15 @@
                 <w:i w:val="0"/>
                 <w:sz w:val="19"/>
               </w:rPr>
-              <w:t>0.039787</w:t>
+              <w:t xml:space="preserve">0.</w:t>
+            </w:r>
+            <w:r>
+              <w:rPr>
+                <w:b w:val="0"/>
+                <w:i w:val="0"/>
+                <w:sz w:val="19"/>
+              </w:rPr>
+              <w:t xml:space="preserve">040</w:t>
             </w:r>
           </w:p>
         </w:tc>
@@ -5304,7 +6415,15 @@
                 <w:i w:val="0"/>
                 <w:sz w:val="19"/>
               </w:rPr>
-              <w:t>0.054438</w:t>
+              <w:t xml:space="preserve">0.</w:t>
+            </w:r>
+            <w:r>
+              <w:rPr>
+                <w:b w:val="0"/>
+                <w:i w:val="0"/>
+                <w:sz w:val="19"/>
+              </w:rPr>
+              <w:t xml:space="preserve">054</w:t>
             </w:r>
           </w:p>
         </w:tc>
@@ -5363,7 +6482,15 @@
                 <w:i w:val="0"/>
                 <w:sz w:val="19"/>
               </w:rPr>
-              <w:t>0.035665</w:t>
+              <w:t xml:space="preserve">0.</w:t>
+            </w:r>
+            <w:r>
+              <w:rPr>
+                <w:b w:val="0"/>
+                <w:i w:val="0"/>
+                <w:sz w:val="19"/>
+              </w:rPr>
+              <w:t xml:space="preserve">036</w:t>
             </w:r>
           </w:p>
         </w:tc>
@@ -5381,7 +6508,15 @@
                 <w:i w:val="0"/>
                 <w:sz w:val="19"/>
               </w:rPr>
-              <w:t>0.038950</w:t>
+              <w:t xml:space="preserve">0.</w:t>
+            </w:r>
+            <w:r>
+              <w:rPr>
+                <w:b w:val="0"/>
+                <w:i w:val="0"/>
+                <w:sz w:val="19"/>
+              </w:rPr>
+              <w:t xml:space="preserve">039</w:t>
             </w:r>
           </w:p>
         </w:tc>
@@ -5440,7 +6575,15 @@
                 <w:i w:val="0"/>
                 <w:sz w:val="19"/>
               </w:rPr>
-              <w:t>0.035322</w:t>
+              <w:t xml:space="preserve">0.</w:t>
+            </w:r>
+            <w:r>
+              <w:rPr>
+                <w:b w:val="0"/>
+                <w:i w:val="0"/>
+                <w:sz w:val="19"/>
+              </w:rPr>
+              <w:t xml:space="preserve">035</w:t>
             </w:r>
           </w:p>
         </w:tc>
@@ -5458,7 +6601,15 @@
                 <w:i w:val="0"/>
                 <w:sz w:val="19"/>
               </w:rPr>
-              <w:t>0.041448</w:t>
+              <w:t xml:space="preserve">0.</w:t>
+            </w:r>
+            <w:r>
+              <w:rPr>
+                <w:b w:val="0"/>
+                <w:i w:val="0"/>
+                <w:sz w:val="19"/>
+              </w:rPr>
+              <w:t xml:space="preserve">041</w:t>
             </w:r>
           </w:p>
         </w:tc>
@@ -5493,7 +6644,35 @@
           <w:b w:val="0"/>
           <w:i w:val="0"/>
         </w:rPr>
-        <w:t xml:space="preserve">At one decimal, road-down fails the improvement-ratio criterion (0.975955; required at least 2), while four-file maximum RMSE is 0.058637 C. Other primary-state criteria are met. Representative changes are secondary tie-breaks, not changes in the primary minimax value.</w:t>
+        <w:t xml:space="preserve">At one decimal, road-down fails the improvement-ratio criterion (0.</w:t>
+      </w:r>
+      <w:r>
+        <w:rPr>
+          <w:b w:val="0"/>
+          <w:i w:val="0"/>
+        </w:rPr>
+        <w:t xml:space="preserve">98</w:t>
+      </w:r>
+      <w:r>
+        <w:rPr>
+          <w:b w:val="0"/>
+          <w:i w:val="0"/>
+        </w:rPr>
+        <w:t xml:space="preserve">; required at least 2), while four-file maximum RMSE is 0.</w:t>
+      </w:r>
+      <w:r>
+        <w:rPr>
+          <w:b w:val="0"/>
+          <w:i w:val="0"/>
+        </w:rPr>
+        <w:t xml:space="preserve">059</w:t>
+      </w:r>
+      <w:r>
+        <w:rPr>
+          <w:b w:val="0"/>
+          <w:i w:val="0"/>
+        </w:rPr>
+        <w:t xml:space="preserve"> C. Other primary-state criteria are met. Representative changes are secondary tie-breaks, not changes in the primary minimax value.</w:t>
       </w:r>
     </w:p>
     <w:p>
@@ -5636,7 +6815,15 @@
                 <w:i w:val="0"/>
                 <w:sz w:val="19"/>
               </w:rPr>
-              <w:t>0.348700</w:t>
+              <w:t xml:space="preserve">0.</w:t>
+            </w:r>
+            <w:r>
+              <w:rPr>
+                <w:b w:val="0"/>
+                <w:i w:val="0"/>
+                <w:sz w:val="19"/>
+              </w:rPr>
+              <w:t xml:space="preserve">349</w:t>
             </w:r>
           </w:p>
         </w:tc>
@@ -5698,7 +6885,15 @@
                 <w:i w:val="0"/>
                 <w:sz w:val="19"/>
               </w:rPr>
-              <w:t>0.347276</w:t>
+              <w:t xml:space="preserve">0.</w:t>
+            </w:r>
+            <w:r>
+              <w:rPr>
+                <w:b w:val="0"/>
+                <w:i w:val="0"/>
+                <w:sz w:val="19"/>
+              </w:rPr>
+              <w:t xml:space="preserve">347</w:t>
             </w:r>
           </w:p>
         </w:tc>
@@ -5758,7 +6953,15 @@
                 <w:i w:val="0"/>
                 <w:sz w:val="19"/>
               </w:rPr>
-              <w:t>0.363368</w:t>
+              <w:t xml:space="preserve">0.</w:t>
+            </w:r>
+            <w:r>
+              <w:rPr>
+                <w:b w:val="0"/>
+                <w:i w:val="0"/>
+                <w:sz w:val="19"/>
+              </w:rPr>
+              <w:t xml:space="preserve">363</w:t>
             </w:r>
           </w:p>
         </w:tc>
@@ -5859,6 +7062,7 @@
     <w:p>
       <w:pPr>
         <w:pStyle w:val="Heading1"/>
+        <w:keepNext/>
       </w:pPr>
       <w:r>
         <w:rPr>
@@ -5920,6 +7124,7 @@
     <w:p>
       <w:pPr>
         <w:pStyle w:val="Heading1"/>
+        <w:keepNext/>
         <w:pageBreakBefore/>
       </w:pPr>
       <w:r>
@@ -5982,6 +7187,7 @@
     <w:p>
       <w:pPr>
         <w:pStyle w:val="Heading1"/>
+        <w:keepNext/>
         <w:pageBreakBefore/>
       </w:pPr>
       <w:r>
@@ -5996,12 +7202,13 @@
       <w:pPr>
         <w:keepNext/>
         <w:jc w:val="center"/>
+        <w:rPr/>
       </w:pPr>
       <w:r>
         <w:drawing>
           <wp:inline xmlns:a="http://schemas.openxmlformats.org/drawingml/2006/main" xmlns:pic="http://schemas.openxmlformats.org/drawingml/2006/picture">
-            <wp:extent cx="6099048" cy="4888386"/>
-            <wp:docPr id="3" name="Picture 3"/>
+            <wp:extent cx="6099048" cy="5513806"/>
+            <wp:docPr id="7" name="figureS3_heat_reduction_curves" descr="figureS3 heat reduction curves"/>
             <wp:cNvGraphicFramePr>
               <a:graphicFrameLocks noChangeAspect="1"/>
             </wp:cNvGraphicFramePr>
@@ -6013,7 +7220,7 @@
                     <pic:cNvPicPr/>
                   </pic:nvPicPr>
                   <pic:blipFill>
-                    <a:blip r:embed="rId12"/>
+                    <a:blip r:embed="rIdRev02_figureS3_heat_reduction_curves"/>
                     <a:stretch>
                       <a:fillRect/>
                     </a:stretch>
@@ -6021,7 +7228,7 @@
                   <pic:spPr>
                     <a:xfrm>
                       <a:off x="0" y="0"/>
-                      <a:ext cx="6099048" cy="4888386"/>
+                      <a:ext cx="6099048" cy="5513806"/>
                     </a:xfrm>
                     <a:prstGeom prst="rect"/>
                   </pic:spPr>
@@ -6044,6 +7251,7 @@
     <w:p>
       <w:pPr>
         <w:pStyle w:val="Heading1"/>
+        <w:keepNext/>
         <w:pageBreakBefore/>
       </w:pPr>
       <w:r>
@@ -6058,12 +7266,13 @@
       <w:pPr>
         <w:keepNext/>
         <w:jc w:val="center"/>
+        <w:rPr/>
       </w:pPr>
       <w:r>
         <w:drawing>
           <wp:inline xmlns:a="http://schemas.openxmlformats.org/drawingml/2006/main" xmlns:pic="http://schemas.openxmlformats.org/drawingml/2006/picture">
-            <wp:extent cx="6099048" cy="3506160"/>
-            <wp:docPr id="4" name="Picture 4"/>
+            <wp:extent cx="6099048" cy="4265989"/>
+            <wp:docPr id="8" name="figureS4_existing_vs_regenerated" descr="figureS4 existing vs regenerated"/>
             <wp:cNvGraphicFramePr>
               <a:graphicFrameLocks noChangeAspect="1"/>
             </wp:cNvGraphicFramePr>
@@ -6075,7 +7284,7 @@
                     <pic:cNvPicPr/>
                   </pic:nvPicPr>
                   <pic:blipFill>
-                    <a:blip r:embed="rId13"/>
+                    <a:blip r:embed="rIdRev02_figureS4_existing_vs_regenerated"/>
                     <a:stretch>
                       <a:fillRect/>
                     </a:stretch>
@@ -6083,7 +7292,7 @@
                   <pic:spPr>
                     <a:xfrm>
                       <a:off x="0" y="0"/>
-                      <a:ext cx="6099048" cy="3506160"/>
+                      <a:ext cx="6099048" cy="4265989"/>
                     </a:xfrm>
                     <a:prstGeom prst="rect"/>
                   </pic:spPr>
@@ -6106,6 +7315,7 @@
     <w:p>
       <w:pPr>
         <w:pStyle w:val="Heading1"/>
+        <w:keepNext/>
         <w:pageBreakBefore/>
       </w:pPr>
       <w:r>
@@ -6120,12 +7330,13 @@
       <w:pPr>
         <w:keepNext/>
         <w:jc w:val="center"/>
+        <w:rPr/>
       </w:pPr>
       <w:r>
         <w:drawing>
           <wp:inline xmlns:a="http://schemas.openxmlformats.org/drawingml/2006/main" xmlns:pic="http://schemas.openxmlformats.org/drawingml/2006/picture">
-            <wp:extent cx="6099048" cy="3123184"/>
-            <wp:docPr id="5" name="Picture 5"/>
+            <wp:extent cx="6099048" cy="3305141"/>
+            <wp:docPr id="9" name="figureS5_nonmedoid_spatial" descr="figureS5 nonmedoid spatial"/>
             <wp:cNvGraphicFramePr>
               <a:graphicFrameLocks noChangeAspect="1"/>
             </wp:cNvGraphicFramePr>
@@ -6137,7 +7348,7 @@
                     <pic:cNvPicPr/>
                   </pic:nvPicPr>
                   <pic:blipFill>
-                    <a:blip r:embed="rId14"/>
+                    <a:blip r:embed="rIdRev02_figureS5_nonmedoid_spatial"/>
                     <a:stretch>
                       <a:fillRect/>
                     </a:stretch>
@@ -6145,7 +7356,7 @@
                   <pic:spPr>
                     <a:xfrm>
                       <a:off x="0" y="0"/>
-                      <a:ext cx="6099048" cy="3123184"/>
+                      <a:ext cx="6099048" cy="3305141"/>
                     </a:xfrm>
                     <a:prstGeom prst="rect"/>
                   </pic:spPr>
@@ -6168,6 +7379,7 @@
     <w:p>
       <w:pPr>
         <w:pStyle w:val="Heading1"/>
+        <w:keepNext/>
         <w:pageBreakBefore/>
       </w:pPr>
       <w:r>
@@ -6182,12 +7394,13 @@
       <w:pPr>
         <w:keepNext/>
         <w:jc w:val="center"/>
+        <w:rPr/>
       </w:pPr>
       <w:r>
         <w:drawing>
           <wp:inline xmlns:a="http://schemas.openxmlformats.org/drawingml/2006/main" xmlns:pic="http://schemas.openxmlformats.org/drawingml/2006/picture">
-            <wp:extent cx="6099048" cy="2184573"/>
-            <wp:docPr id="6" name="Picture 6"/>
+            <wp:extent cx="6099048" cy="2581831"/>
+            <wp:docPr id="10" name="figureS6_timing_profiles" descr="figureS6 timing profiles"/>
             <wp:cNvGraphicFramePr>
               <a:graphicFrameLocks noChangeAspect="1"/>
             </wp:cNvGraphicFramePr>
@@ -6199,7 +7412,7 @@
                     <pic:cNvPicPr/>
                   </pic:nvPicPr>
                   <pic:blipFill>
-                    <a:blip r:embed="rId15"/>
+                    <a:blip r:embed="rIdRev02_figureS6_timing_profiles"/>
                     <a:stretch>
                       <a:fillRect/>
                     </a:stretch>
@@ -6207,7 +7420,7 @@
                   <pic:spPr>
                     <a:xfrm>
                       <a:off x="0" y="0"/>
-                      <a:ext cx="6099048" cy="2184573"/>
+                      <a:ext cx="6099048" cy="2581831"/>
                     </a:xfrm>
                     <a:prstGeom prst="rect"/>
                   </pic:spPr>

</xml_diff>